<commit_message>
Deploy preview for PR 615 🛫
</commit_message>
<xml_diff>
--- a/pr-preview/pr-615/vignettes/articles/version-crosswalk-1.3-to-1.4.docx
+++ b/pr-preview/pr-615/vignettes/articles/version-crosswalk-1.3-to-1.4.docx
@@ -3049,7 +3049,7 @@
         <w:rPr>
           <w:rStyle w:val="CommentTok"/>
         </w:rPr>
-        <w:t xml:space="preserve">#&gt;     age id    antigen_iso value</w:t>
+        <w:t xml:space="preserve">#&gt;     age id    antigen_iso    value</w:t>
       </w:r>
       <w:r>
         <w:br/>
@@ -3058,7 +3058,7 @@
         <w:rPr>
           <w:rStyle w:val="CommentTok"/>
         </w:rPr>
-        <w:t xml:space="preserve">#&gt;   &lt;dbl&gt; &lt;chr&gt; &lt;chr&gt;       &lt;dbl&gt;</w:t>
+        <w:t xml:space="preserve">#&gt;   &lt;dbl&gt; &lt;chr&gt; &lt;chr&gt;          &lt;dbl&gt;</w:t>
       </w:r>
       <w:r>
         <w:br/>
@@ -3067,7 +3067,7 @@
         <w:rPr>
           <w:rStyle w:val="CommentTok"/>
         </w:rPr>
-        <w:t xml:space="preserve">#&gt; 1  8.39 1     HlyE_IgA    0.362</w:t>
+        <w:t xml:space="preserve">#&gt; 1 17.0  1     HlyE_IgA       1.14 </w:t>
       </w:r>
       <w:r>
         <w:br/>
@@ -3076,7 +3076,7 @@
         <w:rPr>
           <w:rStyle w:val="CommentTok"/>
         </w:rPr>
-        <w:t xml:space="preserve">#&gt; 2  8.39 1     HlyE_IgG    0.297</w:t>
+        <w:t xml:space="preserve">#&gt; 2 17.0  1     HlyE_IgG       0.243</w:t>
       </w:r>
       <w:r>
         <w:br/>
@@ -3085,7 +3085,7 @@
         <w:rPr>
           <w:rStyle w:val="CommentTok"/>
         </w:rPr>
-        <w:t xml:space="preserve">#&gt; 3 12.3  2     HlyE_IgA    0.313</w:t>
+        <w:t xml:space="preserve">#&gt; 3  9.19 2     HlyE_IgA      25.7  </w:t>
       </w:r>
       <w:r>
         <w:br/>
@@ -3094,7 +3094,7 @@
         <w:rPr>
           <w:rStyle w:val="CommentTok"/>
         </w:rPr>
-        <w:t xml:space="preserve">#&gt; 4 12.3  2     HlyE_IgG    0.219</w:t>
+        <w:t xml:space="preserve">#&gt; 4  9.19 2     HlyE_IgG    1019.   </w:t>
       </w:r>
       <w:r>
         <w:br/>
@@ -3103,7 +3103,7 @@
         <w:rPr>
           <w:rStyle w:val="CommentTok"/>
         </w:rPr>
-        <w:t xml:space="preserve">#&gt; 5 11.3  3     HlyE_IgA    0.327</w:t>
+        <w:t xml:space="preserve">#&gt; 5  7.56 3     HlyE_IgA       0.725</w:t>
       </w:r>
       <w:r>
         <w:br/>
@@ -3112,7 +3112,7 @@
         <w:rPr>
           <w:rStyle w:val="CommentTok"/>
         </w:rPr>
-        <w:t xml:space="preserve">#&gt; 6 11.3  3     HlyE_IgG    0.393</w:t>
+        <w:t xml:space="preserve">#&gt; 6  7.56 3     HlyE_IgG       0.411</w:t>
       </w:r>
       <w:r>
         <w:br/>

</xml_diff>